<commit_message>
Manual del panel: ingreso por correo y publicación sin token
Co-Authored-By: Claude Sonnet 5.5 <noreply@anthropic.com>
</commit_message>
<xml_diff>
--- a/docs/Manual-Panel-Club-Leones.docx
+++ b/docs/Manual-Panel-Club-Leones.docx
@@ -384,7 +384,7 @@
                 <w:b w:val="0"/>
                 <w:sz w:val="22"/>
               </w:rPr>
-              <w:t>clta.cl/admin.html (escríbala en la barra del navegador).</w:t>
+              <w:t>clta.cl/admin.html (escríbala en la barra del navegador) o el enlace “Panel del club” al final de la página.</w:t>
             </w:r>
           </w:p>
         </w:tc>
@@ -409,7 +409,7 @@
                 <w:b/>
                 <w:sz w:val="22"/>
               </w:rPr>
-              <w:t>La clave del panel</w:t>
+              <w:t>Un correo autorizado</w:t>
             </w:r>
           </w:p>
         </w:tc>
@@ -432,69 +432,7 @@
                 <w:b w:val="0"/>
                 <w:sz w:val="22"/>
               </w:rPr>
-              <w:t>La crea usted la primera vez que entra. Anótela en un lugar seguro.</w:t>
-            </w:r>
-          </w:p>
-        </w:tc>
-      </w:tr>
-      <w:tr>
-        <w:tc>
-          <w:tcPr>
-            <w:tcW w:type="dxa" w:w="2835"/>
-            <w:tcBorders>
-              <w:top w:val="single" w:sz="6" w:color="C9D3E8"/>
-              <w:left w:val="single" w:sz="6" w:color="C9D3E8"/>
-              <w:bottom w:val="single" w:sz="6" w:color="C9D3E8"/>
-              <w:right w:val="single" w:sz="6" w:color="C9D3E8"/>
-            </w:tcBorders>
-          </w:tcPr>
-          <w:p>
-            <w:pPr>
-              <w:spacing w:after="40"/>
-            </w:pPr>
-            <w:r>
-              <w:rPr>
-                <w:b/>
-                <w:sz w:val="22"/>
-              </w:rPr>
-              <w:t>El token de GitHub</w:t>
-            </w:r>
-          </w:p>
-        </w:tc>
-        <w:tc>
-          <w:tcPr>
-            <w:tcW w:type="dxa" w:w="6236"/>
-            <w:tcBorders>
-              <w:top w:val="single" w:sz="6" w:color="C9D3E8"/>
-              <w:left w:val="single" w:sz="6" w:color="C9D3E8"/>
-              <w:bottom w:val="single" w:sz="6" w:color="C9D3E8"/>
-              <w:right w:val="single" w:sz="6" w:color="C9D3E8"/>
-            </w:tcBorders>
-          </w:tcPr>
-          <w:p>
-            <w:pPr>
-              <w:spacing w:after="40"/>
-            </w:pPr>
-            <w:r>
-              <w:rPr>
-                <w:b w:val="0"/>
-                <w:sz w:val="22"/>
-              </w:rPr>
-              <w:t xml:space="preserve">Es la “llave” para publicar. Solo la persona encargada de publicar la tiene. Vence el </w:t>
-            </w:r>
-            <w:r>
-              <w:rPr>
-                <w:b/>
-                <w:sz w:val="22"/>
-              </w:rPr>
-              <w:t>18 de enero de 2027</w:t>
-            </w:r>
-            <w:r>
-              <w:rPr>
-                <w:b w:val="0"/>
-                <w:sz w:val="22"/>
-              </w:rPr>
-              <w:t>.</w:t>
+              <w:t>Solo pueden entrar los correos que el club autorizó. Hoy: el del club y los de las personas que el administrador agregó.</w:t>
             </w:r>
           </w:p>
         </w:tc>
@@ -582,7 +520,7 @@
               <w:rPr>
                 <w:b/>
               </w:rPr>
-              <w:t>Sobre la clave del panel</w:t>
+              <w:t>No hay clave que recordar</w:t>
             </w:r>
           </w:p>
           <w:p>
@@ -593,19 +531,31 @@
               <w:rPr>
                 <w:b w:val="0"/>
               </w:rPr>
-              <w:t xml:space="preserve">La clave </w:t>
+              <w:t xml:space="preserve">Para entrar se usa </w:t>
             </w:r>
             <w:r>
               <w:rPr>
                 <w:b/>
               </w:rPr>
-              <w:t>se guarda solo en el computador</w:t>
+              <w:t>solo el correo</w:t>
             </w:r>
             <w:r>
               <w:rPr>
                 <w:b w:val="0"/>
               </w:rPr>
-              <w:t xml:space="preserve"> donde la crea. Si entra desde otro computador, el panel le pedirá crear otra. No pasa nada: el contenido de la página no se pierde.</w:t>
+              <w:t xml:space="preserve">: la página le envía un </w:t>
+            </w:r>
+            <w:r>
+              <w:rPr>
+                <w:b/>
+              </w:rPr>
+              <w:t>código de 6 números</w:t>
+            </w:r>
+            <w:r>
+              <w:rPr>
+                <w:b w:val="0"/>
+              </w:rPr>
+              <w:t xml:space="preserve"> y usted lo escribe. El código cambia cada vez y dura unos 10 minutos.</w:t>
             </w:r>
           </w:p>
           <w:p>
@@ -616,7 +566,7 @@
               <w:rPr>
                 <w:b w:val="0"/>
               </w:rPr>
-              <w:t>Esta clave es un candado de comodidad. La protección real del sitio está en la cuenta de GitHub del club.</w:t>
+              <w:t>Si un correo no está autorizado, no recibe código y no puede entrar.</w:t>
             </w:r>
           </w:p>
         </w:tc>
@@ -699,21 +649,27 @@
       </w:r>
       <w:r>
         <w:rPr>
+          <w:b w:val="0"/>
+        </w:rPr>
+        <w:t xml:space="preserve">Aparece una pantalla de </w:t>
+      </w:r>
+      <w:r>
+        <w:rPr>
           <w:b/>
         </w:rPr>
-        <w:t>Primera vez:</w:t>
+        <w:t>Cloudflare Access</w:t>
       </w:r>
       <w:r>
         <w:rPr>
           <w:b w:val="0"/>
         </w:rPr>
-        <w:t xml:space="preserve"> el panel le pide crear una clave. Escríbala dos veces y haga clic en </w:t>
+        <w:t xml:space="preserve"> que pide su correo. Escríbalo y haga clic en </w:t>
       </w:r>
       <w:r>
         <w:rPr>
           <w:b/>
         </w:rPr>
-        <w:t>Crear clave y entrar</w:t>
+        <w:t>Send me a code</w:t>
       </w:r>
       <w:r>
         <w:rPr>
@@ -736,27 +692,64 @@
       </w:r>
       <w:r>
         <w:rPr>
+          <w:b w:val="0"/>
+        </w:rPr>
+        <w:t xml:space="preserve">Abra su correo. Le llega un mensaje con un </w:t>
+      </w:r>
+      <w:r>
+        <w:rPr>
           <w:b/>
         </w:rPr>
-        <w:t>Las siguientes veces:</w:t>
+        <w:t>código de 6 números</w:t>
       </w:r>
       <w:r>
         <w:rPr>
           <w:b w:val="0"/>
         </w:rPr>
-        <w:t xml:space="preserve"> escriba su clave y haga clic en </w:t>
+        <w:t xml:space="preserve">. Si no lo ve, revise </w:t>
       </w:r>
       <w:r>
         <w:rPr>
           <w:b/>
         </w:rPr>
-        <w:t>Entrar</w:t>
+        <w:t>spam</w:t>
       </w:r>
       <w:r>
         <w:rPr>
           <w:b w:val="0"/>
         </w:rPr>
         <w:t>.</w:t>
+      </w:r>
+    </w:p>
+    <w:p>
+      <w:pPr>
+        <w:spacing w:after="80"/>
+        <w:ind w:left="510" w:hanging="510"/>
+      </w:pPr>
+      <w:r>
+        <w:rPr>
+          <w:b/>
+          <w:color w:val="B8860B"/>
+        </w:rPr>
+        <w:t xml:space="preserve">5.  </w:t>
+      </w:r>
+      <w:r>
+        <w:rPr>
+          <w:b w:val="0"/>
+        </w:rPr>
+        <w:t xml:space="preserve">Escriba el código en la pantalla y haga clic en </w:t>
+      </w:r>
+      <w:r>
+        <w:rPr>
+          <w:b/>
+        </w:rPr>
+        <w:t>Sign in</w:t>
+      </w:r>
+      <w:r>
+        <w:rPr>
+          <w:b w:val="0"/>
+        </w:rPr>
+        <w:t>. Entra directo al panel, sin otra clave.</w:t>
       </w:r>
     </w:p>
     <w:p>
@@ -788,8 +781,94 @@
         <w:rPr>
           <w:b w:val="0"/>
         </w:rPr>
-        <w:t xml:space="preserve"> (naranja).</w:t>
+        <w:t xml:space="preserve"> (naranja). La sesión se mantiene abierta en ese navegador por un tiempo, así que no tendrá que repetir el código a cada rato.</w:t>
       </w:r>
+    </w:p>
+    <w:tbl>
+      <w:tblPr>
+        <w:tblW w:type="auto" w:w="0"/>
+        <w:jc w:val="center"/>
+        <w:tblLook w:firstColumn="1" w:firstRow="1" w:lastColumn="0" w:lastRow="0" w:noHBand="0" w:noVBand="1" w:val="04A0"/>
+      </w:tblPr>
+      <w:tblGrid>
+        <w:gridCol w:w="9746"/>
+      </w:tblGrid>
+      <w:tr>
+        <w:tc>
+          <w:tcPr>
+            <w:tcW w:type="dxa" w:w="9746"/>
+            <w:shd w:val="clear" w:color="auto" w:fill="FFF6DC"/>
+            <w:tcBorders>
+              <w:top w:val="single" w:sz="6" w:color="E3C56F"/>
+              <w:left w:val="single" w:sz="6" w:color="E3C56F"/>
+              <w:bottom w:val="single" w:sz="6" w:color="E3C56F"/>
+              <w:right w:val="single" w:sz="6" w:color="E3C56F"/>
+            </w:tcBorders>
+          </w:tcPr>
+          <w:p>
+            <w:pPr>
+              <w:spacing w:after="40"/>
+            </w:pPr>
+            <w:r>
+              <w:rPr>
+                <w:b/>
+              </w:rPr>
+              <w:t>Si no aparece la pantalla del correo</w:t>
+            </w:r>
+          </w:p>
+          <w:p>
+            <w:pPr>
+              <w:spacing w:after="40"/>
+            </w:pPr>
+            <w:r>
+              <w:rPr>
+                <w:b w:val="0"/>
+              </w:rPr>
+              <w:t xml:space="preserve">Su navegador pudo guardar una copia vieja de la página. Recargue con </w:t>
+            </w:r>
+            <w:r>
+              <w:rPr>
+                <w:b/>
+              </w:rPr>
+              <w:t>Ctrl + Shift + R</w:t>
+            </w:r>
+            <w:r>
+              <w:rPr>
+                <w:b w:val="0"/>
+              </w:rPr>
+              <w:t xml:space="preserve">, o abra una </w:t>
+            </w:r>
+            <w:r>
+              <w:rPr>
+                <w:b/>
+              </w:rPr>
+              <w:t>ventana de incógnito</w:t>
+            </w:r>
+            <w:r>
+              <w:rPr>
+                <w:b w:val="0"/>
+              </w:rPr>
+              <w:t xml:space="preserve"> (Ctrl + Shift + N) y vuelva a escribir la dirección.</w:t>
+            </w:r>
+          </w:p>
+          <w:p>
+            <w:pPr>
+              <w:spacing w:after="40"/>
+            </w:pPr>
+            <w:r>
+              <w:rPr>
+                <w:b w:val="0"/>
+              </w:rPr>
+              <w:t>Si pide una clave en vez del correo, es la copia vieja: use la ventana de incógnito.</w:t>
+            </w:r>
+          </w:p>
+        </w:tc>
+      </w:tr>
+    </w:tbl>
+    <w:p>
+      <w:pPr>
+        <w:spacing w:after="40"/>
+      </w:pPr>
     </w:p>
     <w:tbl>
       <w:tblPr>
@@ -820,7 +899,7 @@
               <w:rPr>
                 <w:b/>
               </w:rPr>
-              <w:t>¿Olvidó la clave?</w:t>
+              <w:t>Si el código no llega</w:t>
             </w:r>
           </w:p>
           <w:p>
@@ -831,7 +910,42 @@
               <w:rPr>
                 <w:b w:val="0"/>
               </w:rPr>
-              <w:t>Entre desde otro navegador (por ejemplo, Edge si usaba Chrome) y cree una clave nueva. El contenido del sitio no se pierde, porque no vive en la clave.</w:t>
+              <w:t xml:space="preserve">Revise </w:t>
+            </w:r>
+            <w:r>
+              <w:rPr>
+                <w:b/>
+              </w:rPr>
+              <w:t>spam</w:t>
+            </w:r>
+            <w:r>
+              <w:rPr>
+                <w:b w:val="0"/>
+              </w:rPr>
+              <w:t xml:space="preserve"> y espere un minuto. Pida otro código desde la misma pantalla.</w:t>
+            </w:r>
+          </w:p>
+          <w:p>
+            <w:pPr>
+              <w:spacing w:after="40"/>
+            </w:pPr>
+            <w:r>
+              <w:rPr>
+                <w:b w:val="0"/>
+              </w:rPr>
+              <w:t xml:space="preserve">Si nunca llega, es probable que ese correo </w:t>
+            </w:r>
+            <w:r>
+              <w:rPr>
+                <w:b/>
+              </w:rPr>
+              <w:t>no esté autorizado</w:t>
+            </w:r>
+            <w:r>
+              <w:rPr>
+                <w:b w:val="0"/>
+              </w:rPr>
+              <w:t>: pídale al administrador que lo agregue.</w:t>
             </w:r>
           </w:p>
         </w:tc>
@@ -2960,7 +3074,19 @@
         <w:rPr>
           <w:b w:val="0"/>
         </w:rPr>
-        <w:t xml:space="preserve">Es el paso final. Después de publicar, los cambios aparecen en </w:t>
+        <w:t xml:space="preserve">Es el paso final. </w:t>
+      </w:r>
+      <w:r>
+        <w:rPr>
+          <w:b/>
+        </w:rPr>
+        <w:t>No hace falta ningún token ni clave:</w:t>
+      </w:r>
+      <w:r>
+        <w:rPr>
+          <w:b w:val="0"/>
+        </w:rPr>
+        <w:t xml:space="preserve"> basta con haber entrado con su correo. Después de publicar, los cambios aparecen en </w:t>
       </w:r>
       <w:r>
         <w:rPr>
@@ -2978,7 +3104,7 @@
         <w:rPr>
           <w:b/>
         </w:rPr>
-        <w:t>1 o 2 minutos</w:t>
+        <w:t>1 a 3 minutos</w:t>
       </w:r>
       <w:r>
         <w:rPr>
@@ -2992,15 +3118,7 @@
         <w:pStyle w:val="Heading2"/>
       </w:pPr>
       <w:r>
-        <w:t>Primero, una vez: preparar la publicación</w:t>
-      </w:r>
-    </w:p>
-    <w:p>
-      <w:r>
-        <w:rPr>
-          <w:b w:val="0"/>
-        </w:rPr>
-        <w:t>Esto lo hace una sola persona, una sola vez por computador.</w:t>
+        <w:t>Cada vez que quiera publicar</w:t>
       </w:r>
     </w:p>
     <w:p>
@@ -3019,7 +3137,7 @@
         <w:rPr>
           <w:b w:val="0"/>
         </w:rPr>
-        <w:t xml:space="preserve">En el panel, haga clic en </w:t>
+        <w:t xml:space="preserve">Haga clic en </w:t>
       </w:r>
       <w:r>
         <w:rPr>
@@ -3050,19 +3168,294 @@
         <w:rPr>
           <w:b w:val="0"/>
         </w:rPr>
-        <w:t xml:space="preserve">Se abre en la pestaña </w:t>
+        <w:t xml:space="preserve">Se abre la pestaña </w:t>
       </w:r>
       <w:r>
         <w:rPr>
           <w:b/>
         </w:rPr>
-        <w:t>Publicar en GitHub</w:t>
+        <w:t>Publicar con mi cuenta</w:t>
       </w:r>
       <w:r>
         <w:rPr>
           <w:b w:val="0"/>
         </w:rPr>
-        <w:t>. Los datos del club ya vienen escritos; revise que sean estos y pegue el token:</w:t>
+        <w:t>. Arriba dice “Sesión iniciada como” y su correo.</w:t>
+      </w:r>
+    </w:p>
+    <w:p>
+      <w:pPr>
+        <w:spacing w:after="80"/>
+        <w:ind w:left="510" w:hanging="510"/>
+      </w:pPr>
+      <w:r>
+        <w:rPr>
+          <w:b/>
+          <w:color w:val="B8860B"/>
+        </w:rPr>
+        <w:t xml:space="preserve">3.  </w:t>
+      </w:r>
+      <w:r>
+        <w:rPr>
+          <w:b w:val="0"/>
+        </w:rPr>
+        <w:t xml:space="preserve">Haga clic en </w:t>
+      </w:r>
+      <w:r>
+        <w:rPr>
+          <w:b/>
+        </w:rPr>
+        <w:t>Publicar ahora en la página</w:t>
+      </w:r>
+      <w:r>
+        <w:rPr>
+          <w:b w:val="0"/>
+        </w:rPr>
+        <w:t>.</w:t>
+      </w:r>
+    </w:p>
+    <w:p>
+      <w:pPr>
+        <w:spacing w:after="80"/>
+        <w:ind w:left="510" w:hanging="510"/>
+      </w:pPr>
+      <w:r>
+        <w:rPr>
+          <w:b/>
+          <w:color w:val="B8860B"/>
+        </w:rPr>
+        <w:t xml:space="preserve">4.  </w:t>
+      </w:r>
+      <w:r>
+        <w:rPr>
+          <w:b w:val="0"/>
+        </w:rPr>
+        <w:t xml:space="preserve">Espere el mensaje </w:t>
+      </w:r>
+      <w:r>
+        <w:rPr>
+          <w:b/>
+        </w:rPr>
+        <w:t>“¡Publicado!”</w:t>
+      </w:r>
+      <w:r>
+        <w:rPr>
+          <w:b w:val="0"/>
+        </w:rPr>
+        <w:t xml:space="preserve">. El letrero de arriba pasa a </w:t>
+      </w:r>
+      <w:r>
+        <w:rPr>
+          <w:b/>
+        </w:rPr>
+        <w:t>“Todo publicado”</w:t>
+      </w:r>
+      <w:r>
+        <w:rPr>
+          <w:b w:val="0"/>
+        </w:rPr>
+        <w:t>.</w:t>
+      </w:r>
+    </w:p>
+    <w:p>
+      <w:pPr>
+        <w:spacing w:after="80"/>
+        <w:ind w:left="510" w:hanging="510"/>
+      </w:pPr>
+      <w:r>
+        <w:rPr>
+          <w:b/>
+          <w:color w:val="B8860B"/>
+        </w:rPr>
+        <w:t xml:space="preserve">5.  </w:t>
+      </w:r>
+      <w:r>
+        <w:rPr>
+          <w:b w:val="0"/>
+        </w:rPr>
+        <w:t xml:space="preserve">Pasados 1 a 3 minutos, abra </w:t>
+      </w:r>
+      <w:r>
+        <w:rPr>
+          <w:b/>
+        </w:rPr>
+        <w:t>clta.cl</w:t>
+      </w:r>
+      <w:r>
+        <w:rPr>
+          <w:b w:val="0"/>
+        </w:rPr>
+        <w:t xml:space="preserve"> y recargue con </w:t>
+      </w:r>
+      <w:r>
+        <w:rPr>
+          <w:b/>
+        </w:rPr>
+        <w:t>Ctrl + F5</w:t>
+      </w:r>
+      <w:r>
+        <w:rPr>
+          <w:b w:val="0"/>
+        </w:rPr>
+        <w:t xml:space="preserve"> para ver el cambio.</w:t>
+      </w:r>
+    </w:p>
+    <w:tbl>
+      <w:tblPr>
+        <w:tblW w:type="auto" w:w="0"/>
+        <w:jc w:val="center"/>
+        <w:tblLook w:firstColumn="1" w:firstRow="1" w:lastColumn="0" w:lastRow="0" w:noHBand="0" w:noVBand="1" w:val="04A0"/>
+      </w:tblPr>
+      <w:tblGrid>
+        <w:gridCol w:w="9746"/>
+      </w:tblGrid>
+      <w:tr>
+        <w:tc>
+          <w:tcPr>
+            <w:tcW w:type="dxa" w:w="9746"/>
+            <w:shd w:val="clear" w:color="auto" w:fill="EAF1FF"/>
+            <w:tcBorders>
+              <w:top w:val="single" w:sz="6" w:color="9DB7EA"/>
+              <w:left w:val="single" w:sz="6" w:color="9DB7EA"/>
+              <w:bottom w:val="single" w:sz="6" w:color="9DB7EA"/>
+              <w:right w:val="single" w:sz="6" w:color="9DB7EA"/>
+            </w:tcBorders>
+          </w:tcPr>
+          <w:p>
+            <w:pPr>
+              <w:spacing w:after="40"/>
+            </w:pPr>
+            <w:r>
+              <w:rPr>
+                <w:b/>
+              </w:rPr>
+              <w:t>Queda registro de quién publicó</w:t>
+            </w:r>
+          </w:p>
+          <w:p>
+            <w:pPr>
+              <w:spacing w:after="40"/>
+            </w:pPr>
+            <w:r>
+              <w:rPr>
+                <w:b w:val="0"/>
+              </w:rPr>
+              <w:t xml:space="preserve">Cada publicación se anota en GitHub con el </w:t>
+            </w:r>
+            <w:r>
+              <w:rPr>
+                <w:b/>
+              </w:rPr>
+              <w:t>correo de quien la hizo</w:t>
+            </w:r>
+            <w:r>
+              <w:rPr>
+                <w:b w:val="0"/>
+              </w:rPr>
+              <w:t>. Así el club siempre sabe quién cambió qué y cuándo.</w:t>
+            </w:r>
+          </w:p>
+        </w:tc>
+      </w:tr>
+    </w:tbl>
+    <w:p>
+      <w:pPr>
+        <w:spacing w:after="40"/>
+      </w:pPr>
+    </w:p>
+    <w:tbl>
+      <w:tblPr>
+        <w:tblW w:type="auto" w:w="0"/>
+        <w:jc w:val="center"/>
+        <w:tblLook w:firstColumn="1" w:firstRow="1" w:lastColumn="0" w:lastRow="0" w:noHBand="0" w:noVBand="1" w:val="04A0"/>
+      </w:tblPr>
+      <w:tblGrid>
+        <w:gridCol w:w="9746"/>
+      </w:tblGrid>
+      <w:tr>
+        <w:tc>
+          <w:tcPr>
+            <w:tcW w:type="dxa" w:w="9746"/>
+            <w:shd w:val="clear" w:color="auto" w:fill="FFF6DC"/>
+            <w:tcBorders>
+              <w:top w:val="single" w:sz="6" w:color="E3C56F"/>
+              <w:left w:val="single" w:sz="6" w:color="E3C56F"/>
+              <w:bottom w:val="single" w:sz="6" w:color="E3C56F"/>
+              <w:right w:val="single" w:sz="6" w:color="E3C56F"/>
+            </w:tcBorders>
+          </w:tcPr>
+          <w:p>
+            <w:pPr>
+              <w:spacing w:after="40"/>
+            </w:pPr>
+            <w:r>
+              <w:rPr>
+                <w:b/>
+              </w:rPr>
+              <w:t>Si no aparece “Publicar con mi cuenta”</w:t>
+            </w:r>
+          </w:p>
+          <w:p>
+            <w:pPr>
+              <w:spacing w:after="40"/>
+            </w:pPr>
+            <w:r>
+              <w:rPr>
+                <w:b w:val="0"/>
+              </w:rPr>
+              <w:t xml:space="preserve">Significa que el panel no reconoció su sesión. Cierre la pestaña, abra una </w:t>
+            </w:r>
+            <w:r>
+              <w:rPr>
+                <w:b/>
+              </w:rPr>
+              <w:t>ventana de incógnito</w:t>
+            </w:r>
+            <w:r>
+              <w:rPr>
+                <w:b w:val="0"/>
+              </w:rPr>
+              <w:t xml:space="preserve"> y entre de nuevo con su correo (capítulo 3). Como alternativa, use la pestaña </w:t>
+            </w:r>
+            <w:r>
+              <w:rPr>
+                <w:b/>
+              </w:rPr>
+              <w:t>Descargar archivos</w:t>
+            </w:r>
+            <w:r>
+              <w:rPr>
+                <w:b w:val="0"/>
+              </w:rPr>
+              <w:t xml:space="preserve">: un administrador con acceso a GitHub sube esos tres archivos a la carpeta </w:t>
+            </w:r>
+            <w:r>
+              <w:rPr>
+                <w:b/>
+              </w:rPr>
+              <w:t>data</w:t>
+            </w:r>
+            <w:r>
+              <w:rPr>
+                <w:b w:val="0"/>
+              </w:rPr>
+              <w:t>.</w:t>
+            </w:r>
+          </w:p>
+        </w:tc>
+      </w:tr>
+    </w:tbl>
+    <w:p>
+      <w:pPr>
+        <w:spacing w:after="40"/>
+      </w:pPr>
+    </w:p>
+    <w:p>
+      <w:pPr>
+        <w:pStyle w:val="Heading2"/>
+      </w:pPr>
+      <w:r>
+        <w:t>Para el administrador del club</w:t>
       </w:r>
     </w:p>
     <w:tbl>
@@ -3078,7 +3471,7 @@
       <w:tr>
         <w:tc>
           <w:tcPr>
-            <w:tcW w:type="dxa" w:w="2268"/>
+            <w:tcW w:type="dxa" w:w="2835"/>
             <w:shd w:val="clear" w:color="auto" w:fill="0B2A6B"/>
             <w:tcBorders>
               <w:top w:val="single" w:sz="6" w:color="0B2A6B"/>
@@ -3093,13 +3486,13 @@
                 <w:b/>
                 <w:color w:val="FFFFFF"/>
               </w:rPr>
-              <w:t>Campo</w:t>
+              <w:t>Tarea</w:t>
             </w:r>
           </w:p>
         </w:tc>
         <w:tc>
           <w:tcPr>
-            <w:tcW w:type="dxa" w:w="6803"/>
+            <w:tcW w:type="dxa" w:w="6236"/>
             <w:shd w:val="clear" w:color="auto" w:fill="0B2A6B"/>
             <w:tcBorders>
               <w:top w:val="single" w:sz="6" w:color="0B2A6B"/>
@@ -3114,7 +3507,7 @@
                 <w:b/>
                 <w:color w:val="FFFFFF"/>
               </w:rPr>
-              <w:t>Qué escribir</w:t>
+              <w:t>Cómo se hace</w:t>
             </w:r>
           </w:p>
         </w:tc>
@@ -3122,7 +3515,30 @@
       <w:tr>
         <w:tc>
           <w:tcPr>
-            <w:tcW w:type="dxa" w:w="2268"/>
+            <w:tcW w:type="dxa" w:w="2835"/>
+            <w:tcBorders>
+              <w:top w:val="single" w:sz="6" w:color="C9D3E8"/>
+              <w:left w:val="single" w:sz="6" w:color="C9D3E8"/>
+              <w:bottom w:val="single" w:sz="6" w:color="C9D3E8"/>
+              <w:right w:val="single" w:sz="6" w:color="C9D3E8"/>
+            </w:tcBorders>
+          </w:tcPr>
+          <w:p>
+            <w:pPr>
+              <w:spacing w:after="40"/>
+            </w:pPr>
+            <w:r>
+              <w:rPr>
+                <w:b/>
+                <w:sz w:val="22"/>
+              </w:rPr>
+              <w:t>Autorizar a una persona</w:t>
+            </w:r>
+          </w:p>
+        </w:tc>
+        <w:tc>
+          <w:tcPr>
+            <w:tcW w:type="dxa" w:w="6236"/>
             <w:tcBorders>
               <w:top w:val="single" w:sz="6" w:color="C9D3E8"/>
               <w:left w:val="single" w:sz="6" w:color="C9D3E8"/>
@@ -3139,13 +3555,66 @@
                 <w:b w:val="0"/>
                 <w:sz w:val="22"/>
               </w:rPr>
-              <w:t>Usuario</w:t>
+              <w:t xml:space="preserve">Cloudflare (cuenta del club) → Zero Trust → Access controls → Applications → </w:t>
+            </w:r>
+            <w:r>
+              <w:rPr>
+                <w:b/>
+                <w:sz w:val="22"/>
+              </w:rPr>
+              <w:t>Panel del club</w:t>
+            </w:r>
+            <w:r>
+              <w:rPr>
+                <w:b w:val="0"/>
+                <w:sz w:val="22"/>
+              </w:rPr>
+              <w:t xml:space="preserve"> → política </w:t>
+            </w:r>
+            <w:r>
+              <w:rPr>
+                <w:b/>
+                <w:sz w:val="22"/>
+              </w:rPr>
+              <w:t>Editores del club</w:t>
+            </w:r>
+            <w:r>
+              <w:rPr>
+                <w:b w:val="0"/>
+                <w:sz w:val="22"/>
+              </w:rPr>
+              <w:t xml:space="preserve"> → agregar su correo. Máximo 50 personas gratis.</w:t>
+            </w:r>
+          </w:p>
+        </w:tc>
+      </w:tr>
+      <w:tr>
+        <w:tc>
+          <w:tcPr>
+            <w:tcW w:type="dxa" w:w="2835"/>
+            <w:tcBorders>
+              <w:top w:val="single" w:sz="6" w:color="C9D3E8"/>
+              <w:left w:val="single" w:sz="6" w:color="C9D3E8"/>
+              <w:bottom w:val="single" w:sz="6" w:color="C9D3E8"/>
+              <w:right w:val="single" w:sz="6" w:color="C9D3E8"/>
+            </w:tcBorders>
+          </w:tcPr>
+          <w:p>
+            <w:pPr>
+              <w:spacing w:after="40"/>
+            </w:pPr>
+            <w:r>
+              <w:rPr>
+                <w:b/>
+                <w:sz w:val="22"/>
+              </w:rPr>
+              <w:t>Quitar a una persona</w:t>
             </w:r>
           </w:p>
         </w:tc>
         <w:tc>
           <w:tcPr>
-            <w:tcW w:type="dxa" w:w="6803"/>
+            <w:tcW w:type="dxa" w:w="6236"/>
             <w:tcBorders>
               <w:top w:val="single" w:sz="6" w:color="C9D3E8"/>
               <w:left w:val="single" w:sz="6" w:color="C9D3E8"/>
@@ -3162,7 +3631,7 @@
                 <w:b w:val="0"/>
                 <w:sz w:val="22"/>
               </w:rPr>
-              <w:t>clubleonestemucoantumalal-arch</w:t>
+              <w:t>Misma pantalla: borrar su correo de la política.</w:t>
             </w:r>
           </w:p>
         </w:tc>
@@ -3170,7 +3639,30 @@
       <w:tr>
         <w:tc>
           <w:tcPr>
-            <w:tcW w:type="dxa" w:w="2268"/>
+            <w:tcW w:type="dxa" w:w="2835"/>
+            <w:tcBorders>
+              <w:top w:val="single" w:sz="6" w:color="C9D3E8"/>
+              <w:left w:val="single" w:sz="6" w:color="C9D3E8"/>
+              <w:bottom w:val="single" w:sz="6" w:color="C9D3E8"/>
+              <w:right w:val="single" w:sz="6" w:color="C9D3E8"/>
+            </w:tcBorders>
+          </w:tcPr>
+          <w:p>
+            <w:pPr>
+              <w:spacing w:after="40"/>
+            </w:pPr>
+            <w:r>
+              <w:rPr>
+                <w:b/>
+                <w:sz w:val="22"/>
+              </w:rPr>
+              <w:t>Renovar la llave de GitHub</w:t>
+            </w:r>
+          </w:p>
+        </w:tc>
+        <w:tc>
+          <w:tcPr>
+            <w:tcW w:type="dxa" w:w="6236"/>
             <w:tcBorders>
               <w:top w:val="single" w:sz="6" w:color="C9D3E8"/>
               <w:left w:val="single" w:sz="6" w:color="C9D3E8"/>
@@ -3187,133 +3679,35 @@
                 <w:b w:val="0"/>
                 <w:sz w:val="22"/>
               </w:rPr>
-              <w:t>Repositorio</w:t>
-            </w:r>
-          </w:p>
-        </w:tc>
-        <w:tc>
-          <w:tcPr>
-            <w:tcW w:type="dxa" w:w="6803"/>
-            <w:tcBorders>
-              <w:top w:val="single" w:sz="6" w:color="C9D3E8"/>
-              <w:left w:val="single" w:sz="6" w:color="C9D3E8"/>
-              <w:bottom w:val="single" w:sz="6" w:color="C9D3E8"/>
-              <w:right w:val="single" w:sz="6" w:color="C9D3E8"/>
-            </w:tcBorders>
-          </w:tcPr>
-          <w:p>
-            <w:pPr>
-              <w:spacing w:after="40"/>
-            </w:pPr>
-            <w:r>
-              <w:rPr>
-                <w:b w:val="0"/>
-                <w:sz w:val="22"/>
-              </w:rPr>
-              <w:t>clta</w:t>
-            </w:r>
-          </w:p>
-        </w:tc>
-      </w:tr>
-      <w:tr>
-        <w:tc>
-          <w:tcPr>
-            <w:tcW w:type="dxa" w:w="2268"/>
-            <w:tcBorders>
-              <w:top w:val="single" w:sz="6" w:color="C9D3E8"/>
-              <w:left w:val="single" w:sz="6" w:color="C9D3E8"/>
-              <w:bottom w:val="single" w:sz="6" w:color="C9D3E8"/>
-              <w:right w:val="single" w:sz="6" w:color="C9D3E8"/>
-            </w:tcBorders>
-          </w:tcPr>
-          <w:p>
-            <w:pPr>
-              <w:spacing w:after="40"/>
-            </w:pPr>
-            <w:r>
-              <w:rPr>
-                <w:b w:val="0"/>
-                <w:sz w:val="22"/>
-              </w:rPr>
-              <w:t>Rama</w:t>
-            </w:r>
-          </w:p>
-        </w:tc>
-        <w:tc>
-          <w:tcPr>
-            <w:tcW w:type="dxa" w:w="6803"/>
-            <w:tcBorders>
-              <w:top w:val="single" w:sz="6" w:color="C9D3E8"/>
-              <w:left w:val="single" w:sz="6" w:color="C9D3E8"/>
-              <w:bottom w:val="single" w:sz="6" w:color="C9D3E8"/>
-              <w:right w:val="single" w:sz="6" w:color="C9D3E8"/>
-            </w:tcBorders>
-          </w:tcPr>
-          <w:p>
-            <w:pPr>
-              <w:spacing w:after="40"/>
-            </w:pPr>
-            <w:r>
-              <w:rPr>
-                <w:b w:val="0"/>
-                <w:sz w:val="22"/>
-              </w:rPr>
-              <w:t>main</w:t>
-            </w:r>
-          </w:p>
-        </w:tc>
-      </w:tr>
-      <w:tr>
-        <w:tc>
-          <w:tcPr>
-            <w:tcW w:type="dxa" w:w="2268"/>
-            <w:tcBorders>
-              <w:top w:val="single" w:sz="6" w:color="C9D3E8"/>
-              <w:left w:val="single" w:sz="6" w:color="C9D3E8"/>
-              <w:bottom w:val="single" w:sz="6" w:color="C9D3E8"/>
-              <w:right w:val="single" w:sz="6" w:color="C9D3E8"/>
-            </w:tcBorders>
-          </w:tcPr>
-          <w:p>
-            <w:pPr>
-              <w:spacing w:after="40"/>
-            </w:pPr>
-            <w:r>
-              <w:rPr>
-                <w:b w:val="0"/>
-                <w:sz w:val="22"/>
-              </w:rPr>
-              <w:t>Token</w:t>
-            </w:r>
-          </w:p>
-        </w:tc>
-        <w:tc>
-          <w:tcPr>
-            <w:tcW w:type="dxa" w:w="6803"/>
-            <w:tcBorders>
-              <w:top w:val="single" w:sz="6" w:color="C9D3E8"/>
-              <w:left w:val="single" w:sz="6" w:color="C9D3E8"/>
-              <w:bottom w:val="single" w:sz="6" w:color="C9D3E8"/>
-              <w:right w:val="single" w:sz="6" w:color="C9D3E8"/>
-            </w:tcBorders>
-          </w:tcPr>
-          <w:p>
-            <w:pPr>
-              <w:spacing w:after="40"/>
-            </w:pPr>
-            <w:r>
-              <w:rPr>
-                <w:b w:val="0"/>
-                <w:sz w:val="22"/>
-              </w:rPr>
-              <w:t xml:space="preserve">La llave que guardó (empieza con github_pat_). </w:t>
+              <w:t xml:space="preserve">La llave vence el </w:t>
             </w:r>
             <w:r>
               <w:rPr>
                 <w:b/>
                 <w:sz w:val="22"/>
               </w:rPr>
-              <w:t>No la comparta con nadie.</w:t>
+              <w:t>18 de enero de 2027</w:t>
+            </w:r>
+            <w:r>
+              <w:rPr>
+                <w:b w:val="0"/>
+                <w:sz w:val="22"/>
+              </w:rPr>
+              <w:t xml:space="preserve">. Se regenera en GitHub (Settings → Developer settings → Personal access tokens → panel-clta → Regenerate token) y se guarda con el comando `npx wrangler secret put GITHUB_TOKEN` en la carpeta </w:t>
+            </w:r>
+            <w:r>
+              <w:rPr>
+                <w:b/>
+                <w:sz w:val="22"/>
+              </w:rPr>
+              <w:t>worker</w:t>
+            </w:r>
+            <w:r>
+              <w:rPr>
+                <w:b w:val="0"/>
+                <w:sz w:val="22"/>
+              </w:rPr>
+              <w:t xml:space="preserve"> del proyecto.</w:t>
             </w:r>
           </w:p>
         </w:tc>
@@ -3353,24 +3747,7 @@
               <w:rPr>
                 <w:b/>
               </w:rPr>
-              <w:t>Cuidado con el token</w:t>
-            </w:r>
-          </w:p>
-          <w:p>
-            <w:pPr>
-              <w:spacing w:after="40"/>
-            </w:pPr>
-            <w:r>
-              <w:rPr>
-                <w:b/>
-              </w:rPr>
-              <w:t>No marque “Recordar el token”</w:t>
-            </w:r>
-            <w:r>
-              <w:rPr>
-                <w:b w:val="0"/>
-              </w:rPr>
-              <w:t xml:space="preserve"> si el computador lo usan otras personas.</w:t>
+              <w:t>Cuidado</w:t>
             </w:r>
           </w:p>
           <w:p>
@@ -3381,19 +3758,19 @@
               <w:rPr>
                 <w:b w:val="0"/>
               </w:rPr>
-              <w:t xml:space="preserve">Si cree que alguien más vio el token, entre a GitHub → Settings → Developer settings → Personal access tokens, haga clic en </w:t>
+              <w:t xml:space="preserve">La llave de GitHub </w:t>
             </w:r>
             <w:r>
               <w:rPr>
                 <w:b/>
               </w:rPr>
-              <w:t>Delete</w:t>
+              <w:t>solo vive en Cloudflare</w:t>
             </w:r>
             <w:r>
               <w:rPr>
                 <w:b w:val="0"/>
               </w:rPr>
-              <w:t xml:space="preserve"> y cree uno nuevo.</w:t>
+              <w:t>; nadie la pega en el panel. No la comparta por correo ni por chat.</w:t>
             </w:r>
           </w:p>
           <w:p>
@@ -3404,243 +3781,7 @@
               <w:rPr>
                 <w:b w:val="0"/>
               </w:rPr>
-              <w:t xml:space="preserve">El token actual vence el </w:t>
-            </w:r>
-            <w:r>
-              <w:rPr>
-                <w:b/>
-              </w:rPr>
-              <w:t>18 de enero de 2027</w:t>
-            </w:r>
-            <w:r>
-              <w:rPr>
-                <w:b w:val="0"/>
-              </w:rPr>
-              <w:t>. Ese día hay que crear otro.</w:t>
-            </w:r>
-          </w:p>
-        </w:tc>
-      </w:tr>
-    </w:tbl>
-    <w:p>
-      <w:pPr>
-        <w:spacing w:after="40"/>
-      </w:pPr>
-    </w:p>
-    <w:p>
-      <w:pPr>
-        <w:pStyle w:val="Heading2"/>
-      </w:pPr>
-      <w:r>
-        <w:t>Cada vez que quiera publicar</w:t>
-      </w:r>
-    </w:p>
-    <w:p>
-      <w:pPr>
-        <w:spacing w:after="80"/>
-        <w:ind w:left="510" w:hanging="510"/>
-      </w:pPr>
-      <w:r>
-        <w:rPr>
-          <w:b/>
-          <w:color w:val="B8860B"/>
-        </w:rPr>
-        <w:t xml:space="preserve">1.  </w:t>
-      </w:r>
-      <w:r>
-        <w:rPr>
-          <w:b w:val="0"/>
-        </w:rPr>
-        <w:t xml:space="preserve">Haga clic en </w:t>
-      </w:r>
-      <w:r>
-        <w:rPr>
-          <w:b/>
-        </w:rPr>
-        <w:t>Publicar</w:t>
-      </w:r>
-      <w:r>
-        <w:rPr>
-          <w:b w:val="0"/>
-        </w:rPr>
-        <w:t xml:space="preserve"> → pestaña </w:t>
-      </w:r>
-      <w:r>
-        <w:rPr>
-          <w:b/>
-        </w:rPr>
-        <w:t>Publicar en GitHub</w:t>
-      </w:r>
-      <w:r>
-        <w:rPr>
-          <w:b w:val="0"/>
-        </w:rPr>
-        <w:t>.</w:t>
-      </w:r>
-    </w:p>
-    <w:p>
-      <w:pPr>
-        <w:spacing w:after="80"/>
-        <w:ind w:left="510" w:hanging="510"/>
-      </w:pPr>
-      <w:r>
-        <w:rPr>
-          <w:b/>
-          <w:color w:val="B8860B"/>
-        </w:rPr>
-        <w:t xml:space="preserve">2.  </w:t>
-      </w:r>
-      <w:r>
-        <w:rPr>
-          <w:b w:val="0"/>
-        </w:rPr>
-        <w:t xml:space="preserve">Haga clic en el botón </w:t>
-      </w:r>
-      <w:r>
-        <w:rPr>
-          <w:b/>
-        </w:rPr>
-        <w:t>Publicar ahora en GitHub</w:t>
-      </w:r>
-      <w:r>
-        <w:rPr>
-          <w:b w:val="0"/>
-        </w:rPr>
-        <w:t>.</w:t>
-      </w:r>
-    </w:p>
-    <w:p>
-      <w:pPr>
-        <w:spacing w:after="80"/>
-        <w:ind w:left="510" w:hanging="510"/>
-      </w:pPr>
-      <w:r>
-        <w:rPr>
-          <w:b/>
-          <w:color w:val="B8860B"/>
-        </w:rPr>
-        <w:t xml:space="preserve">3.  </w:t>
-      </w:r>
-      <w:r>
-        <w:rPr>
-          <w:b w:val="0"/>
-        </w:rPr>
-        <w:t xml:space="preserve">Espere el mensaje de “publicado”. Después de 1 o 2 minutos, abra </w:t>
-      </w:r>
-      <w:r>
-        <w:rPr>
-          <w:b/>
-        </w:rPr>
-        <w:t>clta.cl</w:t>
-      </w:r>
-      <w:r>
-        <w:rPr>
-          <w:b w:val="0"/>
-        </w:rPr>
-        <w:t xml:space="preserve"> y recargue con </w:t>
-      </w:r>
-      <w:r>
-        <w:rPr>
-          <w:b/>
-        </w:rPr>
-        <w:t>Ctrl + F5</w:t>
-      </w:r>
-      <w:r>
-        <w:rPr>
-          <w:b w:val="0"/>
-        </w:rPr>
-        <w:t>.</w:t>
-      </w:r>
-    </w:p>
-    <w:tbl>
-      <w:tblPr>
-        <w:tblW w:type="auto" w:w="0"/>
-        <w:jc w:val="center"/>
-        <w:tblLook w:firstColumn="1" w:firstRow="1" w:lastColumn="0" w:lastRow="0" w:noHBand="0" w:noVBand="1" w:val="04A0"/>
-      </w:tblPr>
-      <w:tblGrid>
-        <w:gridCol w:w="9746"/>
-      </w:tblGrid>
-      <w:tr>
-        <w:tc>
-          <w:tcPr>
-            <w:tcW w:type="dxa" w:w="9746"/>
-            <w:shd w:val="clear" w:color="auto" w:fill="EAF1FF"/>
-            <w:tcBorders>
-              <w:top w:val="single" w:sz="6" w:color="9DB7EA"/>
-              <w:left w:val="single" w:sz="6" w:color="9DB7EA"/>
-              <w:bottom w:val="single" w:sz="6" w:color="9DB7EA"/>
-              <w:right w:val="single" w:sz="6" w:color="9DB7EA"/>
-            </w:tcBorders>
-          </w:tcPr>
-          <w:p>
-            <w:pPr>
-              <w:spacing w:after="40"/>
-            </w:pPr>
-            <w:r>
-              <w:rPr>
-                <w:b/>
-              </w:rPr>
-              <w:t>Si no tiene el token</w:t>
-            </w:r>
-          </w:p>
-          <w:p>
-            <w:pPr>
-              <w:spacing w:after="40"/>
-            </w:pPr>
-            <w:r>
-              <w:rPr>
-                <w:b w:val="0"/>
-              </w:rPr>
-              <w:t xml:space="preserve">Use la pestaña </w:t>
-            </w:r>
-            <w:r>
-              <w:rPr>
-                <w:b/>
-              </w:rPr>
-              <w:t>Descargar archivos</w:t>
-            </w:r>
-            <w:r>
-              <w:rPr>
-                <w:b w:val="0"/>
-              </w:rPr>
-              <w:t xml:space="preserve"> y haga clic en </w:t>
-            </w:r>
-            <w:r>
-              <w:rPr>
-                <w:b/>
-              </w:rPr>
-              <w:t>Descargar los 3</w:t>
-            </w:r>
-            <w:r>
-              <w:rPr>
-                <w:b w:val="0"/>
-              </w:rPr>
-              <w:t xml:space="preserve">. Un encargado con acceso a GitHub debe subir esos tres archivos a la carpeta </w:t>
-            </w:r>
-            <w:r>
-              <w:rPr>
-                <w:b/>
-              </w:rPr>
-              <w:t>data</w:t>
-            </w:r>
-            <w:r>
-              <w:rPr>
-                <w:b w:val="0"/>
-              </w:rPr>
-              <w:t xml:space="preserve"> del repositorio </w:t>
-            </w:r>
-            <w:r>
-              <w:rPr>
-                <w:b/>
-              </w:rPr>
-              <w:t>clta</w:t>
-            </w:r>
-            <w:r>
-              <w:rPr>
-                <w:b w:val="0"/>
-              </w:rPr>
-              <w:t>. El resultado es el mismo.</w:t>
+              <w:t>Si sospecha que se filtró, bórrela en GitHub y cree otra.</w:t>
             </w:r>
           </w:p>
         </w:tc>
@@ -4050,7 +4191,7 @@
                 <w:b w:val="0"/>
                 <w:sz w:val="22"/>
               </w:rPr>
-              <w:t>Pruebe en otro navegador y cree una clave nueva. El contenido no se pierde.</w:t>
+              <w:t>Use una ventana de incógnito y entre con su correo (capítulo 3). Si no llega el código, avise al administrador.</w:t>
             </w:r>
           </w:p>
         </w:tc>
@@ -4199,7 +4340,7 @@
                 <w:b w:val="0"/>
                 <w:sz w:val="22"/>
               </w:rPr>
-              <w:t>El botón Publicar da error de permiso</w:t>
+              <w:t>El botón Publicar da error</w:t>
             </w:r>
           </w:p>
         </w:tc>
@@ -4222,7 +4363,7 @@
                 <w:b w:val="0"/>
                 <w:sz w:val="22"/>
               </w:rPr>
-              <w:t>El token venció o está mal copiado. Cree uno nuevo (ver capítulo 8).</w:t>
+              <w:t>Pruebe de nuevo en 1 minuto. Si sigue, avise al administrador: puede haber vencido la llave de GitHub (capítulo 8).</w:t>
             </w:r>
           </w:p>
         </w:tc>
@@ -4536,7 +4677,7 @@
         <w:rPr>
           <w:b w:val="0"/>
         </w:rPr>
-        <w:t xml:space="preserve"> la clave del panel ni el token de GitHub.</w:t>
+        <w:t xml:space="preserve"> el código del correo ni la llave de GitHub.</w:t>
       </w:r>
     </w:p>
     <w:p>

</xml_diff>

<commit_message>
Manual: datos para entrar al panel (dirección, correo y cómo obtener el código)
Co-Authored-By: Claude Sonnet 5.5 <noreply@anthropic.com>
</commit_message>
<xml_diff>
--- a/docs/Manual-Panel-Club-Leones.docx
+++ b/docs/Manual-Panel-Club-Leones.docx
@@ -751,6 +751,285 @@
         </w:rPr>
         <w:t>. Entra directo al panel, sin otra clave.</w:t>
       </w:r>
+    </w:p>
+    <w:tbl>
+      <w:tblPr>
+        <w:tblW w:type="auto" w:w="0"/>
+        <w:jc w:val="center"/>
+        <w:tblLook w:firstColumn="1" w:firstRow="1" w:lastColumn="0" w:lastRow="0" w:noHBand="0" w:noVBand="1" w:val="04A0"/>
+      </w:tblPr>
+      <w:tblGrid>
+        <w:gridCol w:w="4873"/>
+        <w:gridCol w:w="4873"/>
+      </w:tblGrid>
+      <w:tr>
+        <w:tc>
+          <w:tcPr>
+            <w:tcW w:type="dxa" w:w="2835"/>
+            <w:shd w:val="clear" w:color="auto" w:fill="0B2A6B"/>
+            <w:tcBorders>
+              <w:top w:val="single" w:sz="6" w:color="0B2A6B"/>
+              <w:left w:val="single" w:sz="6" w:color="0B2A6B"/>
+              <w:bottom w:val="single" w:sz="6" w:color="0B2A6B"/>
+              <w:right w:val="single" w:sz="6" w:color="0B2A6B"/>
+            </w:tcBorders>
+          </w:tcPr>
+          <w:p>
+            <w:r>
+              <w:rPr>
+                <w:b/>
+                <w:color w:val="FFFFFF"/>
+              </w:rPr>
+              <w:t>Datos para entrar</w:t>
+            </w:r>
+          </w:p>
+        </w:tc>
+        <w:tc>
+          <w:tcPr>
+            <w:tcW w:type="dxa" w:w="6236"/>
+            <w:shd w:val="clear" w:color="auto" w:fill="0B2A6B"/>
+            <w:tcBorders>
+              <w:top w:val="single" w:sz="6" w:color="0B2A6B"/>
+              <w:left w:val="single" w:sz="6" w:color="0B2A6B"/>
+              <w:bottom w:val="single" w:sz="6" w:color="0B2A6B"/>
+              <w:right w:val="single" w:sz="6" w:color="0B2A6B"/>
+            </w:tcBorders>
+          </w:tcPr>
+          <w:p>
+            <w:r>
+              <w:rPr>
+                <w:b/>
+                <w:color w:val="FFFFFF"/>
+              </w:rPr>
+            </w:r>
+          </w:p>
+        </w:tc>
+      </w:tr>
+      <w:tr>
+        <w:tc>
+          <w:tcPr>
+            <w:tcW w:type="dxa" w:w="2835"/>
+            <w:tcBorders>
+              <w:top w:val="single" w:sz="6" w:color="C9D3E8"/>
+              <w:left w:val="single" w:sz="6" w:color="C9D3E8"/>
+              <w:bottom w:val="single" w:sz="6" w:color="C9D3E8"/>
+              <w:right w:val="single" w:sz="6" w:color="C9D3E8"/>
+            </w:tcBorders>
+          </w:tcPr>
+          <w:p>
+            <w:pPr>
+              <w:spacing w:after="40"/>
+            </w:pPr>
+            <w:r>
+              <w:rPr>
+                <w:b/>
+                <w:sz w:val="22"/>
+              </w:rPr>
+              <w:t>Dirección del panel</w:t>
+            </w:r>
+          </w:p>
+        </w:tc>
+        <w:tc>
+          <w:tcPr>
+            <w:tcW w:type="dxa" w:w="6236"/>
+            <w:tcBorders>
+              <w:top w:val="single" w:sz="6" w:color="C9D3E8"/>
+              <w:left w:val="single" w:sz="6" w:color="C9D3E8"/>
+              <w:bottom w:val="single" w:sz="6" w:color="C9D3E8"/>
+              <w:right w:val="single" w:sz="6" w:color="C9D3E8"/>
+            </w:tcBorders>
+          </w:tcPr>
+          <w:p>
+            <w:pPr>
+              <w:spacing w:after="40"/>
+            </w:pPr>
+            <w:r>
+              <w:rPr>
+                <w:b w:val="0"/>
+                <w:sz w:val="22"/>
+              </w:rPr>
+              <w:t>https://clta.cl/admin.html</w:t>
+            </w:r>
+          </w:p>
+        </w:tc>
+      </w:tr>
+      <w:tr>
+        <w:tc>
+          <w:tcPr>
+            <w:tcW w:type="dxa" w:w="2835"/>
+            <w:tcBorders>
+              <w:top w:val="single" w:sz="6" w:color="C9D3E8"/>
+              <w:left w:val="single" w:sz="6" w:color="C9D3E8"/>
+              <w:bottom w:val="single" w:sz="6" w:color="C9D3E8"/>
+              <w:right w:val="single" w:sz="6" w:color="C9D3E8"/>
+            </w:tcBorders>
+          </w:tcPr>
+          <w:p>
+            <w:pPr>
+              <w:spacing w:after="40"/>
+            </w:pPr>
+            <w:r>
+              <w:rPr>
+                <w:b/>
+                <w:sz w:val="22"/>
+              </w:rPr>
+              <w:t>Correo para entrar</w:t>
+            </w:r>
+          </w:p>
+        </w:tc>
+        <w:tc>
+          <w:tcPr>
+            <w:tcW w:type="dxa" w:w="6236"/>
+            <w:tcBorders>
+              <w:top w:val="single" w:sz="6" w:color="C9D3E8"/>
+              <w:left w:val="single" w:sz="6" w:color="C9D3E8"/>
+              <w:bottom w:val="single" w:sz="6" w:color="C9D3E8"/>
+              <w:right w:val="single" w:sz="6" w:color="C9D3E8"/>
+            </w:tcBorders>
+          </w:tcPr>
+          <w:p>
+            <w:pPr>
+              <w:spacing w:after="40"/>
+            </w:pPr>
+            <w:r>
+              <w:rPr>
+                <w:b w:val="0"/>
+                <w:sz w:val="22"/>
+              </w:rPr>
+              <w:t>clubleonestemucoantumalal@gmail.com</w:t>
+            </w:r>
+          </w:p>
+        </w:tc>
+      </w:tr>
+      <w:tr>
+        <w:tc>
+          <w:tcPr>
+            <w:tcW w:type="dxa" w:w="2835"/>
+            <w:tcBorders>
+              <w:top w:val="single" w:sz="6" w:color="C9D3E8"/>
+              <w:left w:val="single" w:sz="6" w:color="C9D3E8"/>
+              <w:bottom w:val="single" w:sz="6" w:color="C9D3E8"/>
+              <w:right w:val="single" w:sz="6" w:color="C9D3E8"/>
+            </w:tcBorders>
+          </w:tcPr>
+          <w:p>
+            <w:pPr>
+              <w:spacing w:after="40"/>
+            </w:pPr>
+            <w:r>
+              <w:rPr>
+                <w:b/>
+                <w:sz w:val="22"/>
+              </w:rPr>
+              <w:t>Clave</w:t>
+            </w:r>
+          </w:p>
+        </w:tc>
+        <w:tc>
+          <w:tcPr>
+            <w:tcW w:type="dxa" w:w="6236"/>
+            <w:tcBorders>
+              <w:top w:val="single" w:sz="6" w:color="C9D3E8"/>
+              <w:left w:val="single" w:sz="6" w:color="C9D3E8"/>
+              <w:bottom w:val="single" w:sz="6" w:color="C9D3E8"/>
+              <w:right w:val="single" w:sz="6" w:color="C9D3E8"/>
+            </w:tcBorders>
+          </w:tcPr>
+          <w:p>
+            <w:pPr>
+              <w:spacing w:after="40"/>
+            </w:pPr>
+            <w:r>
+              <w:rPr>
+                <w:b w:val="0"/>
+                <w:sz w:val="22"/>
+              </w:rPr>
+              <w:t xml:space="preserve">No hay clave. Después de escribir el correo, el </w:t>
+            </w:r>
+            <w:r>
+              <w:rPr>
+                <w:b/>
+                <w:sz w:val="22"/>
+              </w:rPr>
+              <w:t>código de 6 números</w:t>
+            </w:r>
+            <w:r>
+              <w:rPr>
+                <w:b w:val="0"/>
+                <w:sz w:val="22"/>
+              </w:rPr>
+              <w:t xml:space="preserve"> llega a ese mismo correo (revise también spam). Ese código es el que se escribe para entrar.</w:t>
+            </w:r>
+          </w:p>
+        </w:tc>
+      </w:tr>
+      <w:tr>
+        <w:tc>
+          <w:tcPr>
+            <w:tcW w:type="dxa" w:w="2835"/>
+            <w:tcBorders>
+              <w:top w:val="single" w:sz="6" w:color="C9D3E8"/>
+              <w:left w:val="single" w:sz="6" w:color="C9D3E8"/>
+              <w:bottom w:val="single" w:sz="6" w:color="C9D3E8"/>
+              <w:right w:val="single" w:sz="6" w:color="C9D3E8"/>
+            </w:tcBorders>
+          </w:tcPr>
+          <w:p>
+            <w:pPr>
+              <w:spacing w:after="40"/>
+            </w:pPr>
+            <w:r>
+              <w:rPr>
+                <w:b/>
+                <w:sz w:val="22"/>
+              </w:rPr>
+              <w:t>Quién abre el correo</w:t>
+            </w:r>
+          </w:p>
+        </w:tc>
+        <w:tc>
+          <w:tcPr>
+            <w:tcW w:type="dxa" w:w="6236"/>
+            <w:tcBorders>
+              <w:top w:val="single" w:sz="6" w:color="C9D3E8"/>
+              <w:left w:val="single" w:sz="6" w:color="C9D3E8"/>
+              <w:bottom w:val="single" w:sz="6" w:color="C9D3E8"/>
+              <w:right w:val="single" w:sz="6" w:color="C9D3E8"/>
+            </w:tcBorders>
+          </w:tcPr>
+          <w:p>
+            <w:pPr>
+              <w:spacing w:after="40"/>
+            </w:pPr>
+            <w:r>
+              <w:rPr>
+                <w:b w:val="0"/>
+                <w:sz w:val="22"/>
+              </w:rPr>
+              <w:t xml:space="preserve">Quien tenga acceso al correo del club. Cada persona autorizada entra con </w:t>
+            </w:r>
+            <w:r>
+              <w:rPr>
+                <w:b/>
+                <w:sz w:val="22"/>
+              </w:rPr>
+              <w:t>su propio correo</w:t>
+            </w:r>
+            <w:r>
+              <w:rPr>
+                <w:b w:val="0"/>
+                <w:sz w:val="22"/>
+              </w:rPr>
+              <w:t xml:space="preserve"> y recibe su propio código.</w:t>
+            </w:r>
+          </w:p>
+        </w:tc>
+      </w:tr>
+    </w:tbl>
+    <w:p>
+      <w:pPr>
+        <w:spacing w:after="40"/>
+      </w:pPr>
     </w:p>
     <w:p>
       <w:r>

</xml_diff>